<commit_message>
feat: extend developer foundation contribution kit
</commit_message>
<xml_diff>
--- a/docs/guides/global-risk-contribute-guide.docx
+++ b/docs/guides/global-risk-contribute-guide.docx
@@ -693,9 +693,9 @@
         </w:tblBorders>
       </w:tblPr>
       <w:tblGrid>
-        <w:gridCol w:w="2300"/>
-        <w:gridCol w:w="2600"/>
-        <w:gridCol w:w="4126"/>
+        <w:gridCol w:w="2735"/>
+        <w:gridCol w:w="2461"/>
+        <w:gridCol w:w="3830"/>
       </w:tblGrid>
       <w:tr>
         <w:trPr>
@@ -703,7 +703,7 @@
         </w:trPr>
         <w:tc>
           <w:tcPr>
-            <w:tcW w:type="dxa" w:w="2300"/>
+            <w:tcW w:type="dxa" w:w="2735"/>
             <w:tcBorders>
               <w:top w:val="single" w:color="BFBFBF" w:sz="4"/>
               <w:left w:val="single" w:color="BFBFBF" w:sz="4"/>
@@ -732,7 +732,7 @@
         </w:tc>
         <w:tc>
           <w:tcPr>
-            <w:tcW w:type="dxa" w:w="2600"/>
+            <w:tcW w:type="dxa" w:w="2461"/>
             <w:tcBorders>
               <w:top w:val="single" w:color="BFBFBF" w:sz="4"/>
               <w:left w:val="single" w:color="BFBFBF" w:sz="4"/>
@@ -761,7 +761,7 @@
         </w:tc>
         <w:tc>
           <w:tcPr>
-            <w:tcW w:type="dxa" w:w="4126"/>
+            <w:tcW w:type="dxa" w:w="3830"/>
             <w:tcBorders>
               <w:top w:val="single" w:color="BFBFBF" w:sz="4"/>
               <w:left w:val="single" w:color="BFBFBF" w:sz="4"/>
@@ -795,7 +795,7 @@
         </w:trPr>
         <w:tc>
           <w:tcPr>
-            <w:tcW w:type="dxa" w:w="2300"/>
+            <w:tcW w:type="dxa" w:w="2735"/>
             <w:tcBorders>
               <w:top w:val="single" w:color="BFBFBF" w:sz="4"/>
               <w:left w:val="single" w:color="BFBFBF" w:sz="4"/>
@@ -821,7 +821,7 @@
         </w:tc>
         <w:tc>
           <w:tcPr>
-            <w:tcW w:type="dxa" w:w="2600"/>
+            <w:tcW w:type="dxa" w:w="2461"/>
             <w:tcBorders>
               <w:top w:val="single" w:color="BFBFBF" w:sz="4"/>
               <w:left w:val="single" w:color="BFBFBF" w:sz="4"/>
@@ -849,7 +849,7 @@
         </w:tc>
         <w:tc>
           <w:tcPr>
-            <w:tcW w:type="dxa" w:w="4126"/>
+            <w:tcW w:type="dxa" w:w="3830"/>
             <w:tcBorders>
               <w:top w:val="single" w:color="BFBFBF" w:sz="4"/>
               <w:left w:val="single" w:color="BFBFBF" w:sz="4"/>
@@ -880,7 +880,7 @@
         </w:trPr>
         <w:tc>
           <w:tcPr>
-            <w:tcW w:type="dxa" w:w="2300"/>
+            <w:tcW w:type="dxa" w:w="2735"/>
             <w:tcBorders>
               <w:top w:val="single" w:color="BFBFBF" w:sz="4"/>
               <w:left w:val="single" w:color="BFBFBF" w:sz="4"/>
@@ -906,7 +906,7 @@
         </w:tc>
         <w:tc>
           <w:tcPr>
-            <w:tcW w:type="dxa" w:w="2600"/>
+            <w:tcW w:type="dxa" w:w="2461"/>
             <w:tcBorders>
               <w:top w:val="single" w:color="BFBFBF" w:sz="4"/>
               <w:left w:val="single" w:color="BFBFBF" w:sz="4"/>
@@ -934,7 +934,7 @@
         </w:tc>
         <w:tc>
           <w:tcPr>
-            <w:tcW w:type="dxa" w:w="4126"/>
+            <w:tcW w:type="dxa" w:w="3830"/>
             <w:tcBorders>
               <w:top w:val="single" w:color="BFBFBF" w:sz="4"/>
               <w:left w:val="single" w:color="BFBFBF" w:sz="4"/>
@@ -965,7 +965,7 @@
         </w:trPr>
         <w:tc>
           <w:tcPr>
-            <w:tcW w:type="dxa" w:w="2300"/>
+            <w:tcW w:type="dxa" w:w="2735"/>
             <w:tcBorders>
               <w:top w:val="single" w:color="BFBFBF" w:sz="4"/>
               <w:left w:val="single" w:color="BFBFBF" w:sz="4"/>
@@ -991,7 +991,7 @@
         </w:tc>
         <w:tc>
           <w:tcPr>
-            <w:tcW w:type="dxa" w:w="2600"/>
+            <w:tcW w:type="dxa" w:w="2461"/>
             <w:tcBorders>
               <w:top w:val="single" w:color="BFBFBF" w:sz="4"/>
               <w:left w:val="single" w:color="BFBFBF" w:sz="4"/>
@@ -1019,7 +1019,7 @@
         </w:tc>
         <w:tc>
           <w:tcPr>
-            <w:tcW w:type="dxa" w:w="4126"/>
+            <w:tcW w:type="dxa" w:w="3830"/>
             <w:tcBorders>
               <w:top w:val="single" w:color="BFBFBF" w:sz="4"/>
               <w:left w:val="single" w:color="BFBFBF" w:sz="4"/>
@@ -1050,7 +1050,7 @@
         </w:trPr>
         <w:tc>
           <w:tcPr>
-            <w:tcW w:type="dxa" w:w="2300"/>
+            <w:tcW w:type="dxa" w:w="2735"/>
             <w:tcBorders>
               <w:top w:val="single" w:color="BFBFBF" w:sz="4"/>
               <w:left w:val="single" w:color="BFBFBF" w:sz="4"/>
@@ -1076,7 +1076,7 @@
         </w:tc>
         <w:tc>
           <w:tcPr>
-            <w:tcW w:type="dxa" w:w="2600"/>
+            <w:tcW w:type="dxa" w:w="2461"/>
             <w:tcBorders>
               <w:top w:val="single" w:color="BFBFBF" w:sz="4"/>
               <w:left w:val="single" w:color="BFBFBF" w:sz="4"/>
@@ -1104,7 +1104,7 @@
         </w:tc>
         <w:tc>
           <w:tcPr>
-            <w:tcW w:type="dxa" w:w="4126"/>
+            <w:tcW w:type="dxa" w:w="3830"/>
             <w:tcBorders>
               <w:top w:val="single" w:color="BFBFBF" w:sz="4"/>
               <w:left w:val="single" w:color="BFBFBF" w:sz="4"/>
@@ -1135,7 +1135,7 @@
         </w:trPr>
         <w:tc>
           <w:tcPr>
-            <w:tcW w:type="dxa" w:w="2300"/>
+            <w:tcW w:type="dxa" w:w="2735"/>
             <w:tcBorders>
               <w:top w:val="single" w:color="BFBFBF" w:sz="4"/>
               <w:left w:val="single" w:color="BFBFBF" w:sz="4"/>
@@ -1161,7 +1161,7 @@
         </w:tc>
         <w:tc>
           <w:tcPr>
-            <w:tcW w:type="dxa" w:w="2600"/>
+            <w:tcW w:type="dxa" w:w="2461"/>
             <w:tcBorders>
               <w:top w:val="single" w:color="BFBFBF" w:sz="4"/>
               <w:left w:val="single" w:color="BFBFBF" w:sz="4"/>
@@ -1189,7 +1189,7 @@
         </w:tc>
         <w:tc>
           <w:tcPr>
-            <w:tcW w:type="dxa" w:w="4126"/>
+            <w:tcW w:type="dxa" w:w="3830"/>
             <w:tcBorders>
               <w:top w:val="single" w:color="BFBFBF" w:sz="4"/>
               <w:left w:val="single" w:color="BFBFBF" w:sz="4"/>
@@ -1220,7 +1220,7 @@
         </w:trPr>
         <w:tc>
           <w:tcPr>
-            <w:tcW w:type="dxa" w:w="2300"/>
+            <w:tcW w:type="dxa" w:w="2735"/>
             <w:tcBorders>
               <w:top w:val="single" w:color="BFBFBF" w:sz="4"/>
               <w:left w:val="single" w:color="BFBFBF" w:sz="4"/>
@@ -1246,7 +1246,7 @@
         </w:tc>
         <w:tc>
           <w:tcPr>
-            <w:tcW w:type="dxa" w:w="2600"/>
+            <w:tcW w:type="dxa" w:w="2461"/>
             <w:tcBorders>
               <w:top w:val="single" w:color="BFBFBF" w:sz="4"/>
               <w:left w:val="single" w:color="BFBFBF" w:sz="4"/>
@@ -1274,7 +1274,7 @@
         </w:tc>
         <w:tc>
           <w:tcPr>
-            <w:tcW w:type="dxa" w:w="4126"/>
+            <w:tcW w:type="dxa" w:w="3830"/>
             <w:tcBorders>
               <w:top w:val="single" w:color="BFBFBF" w:sz="4"/>
               <w:left w:val="single" w:color="BFBFBF" w:sz="4"/>
@@ -1305,33 +1305,33 @@
         </w:trPr>
         <w:tc>
           <w:tcPr>
-            <w:tcW w:type="dxa" w:w="2300"/>
-            <w:tcBorders>
-              <w:top w:val="single" w:color="BFBFBF" w:sz="4"/>
-              <w:left w:val="single" w:color="BFBFBF" w:sz="4"/>
-              <w:bottom w:val="single" w:color="BFBFBF" w:sz="4"/>
-              <w:right w:val="single" w:color="BFBFBF" w:sz="4"/>
-            </w:tcBorders>
-            <w:tcMar>
-              <w:top w:type="dxa" w:w="60"/>
-              <w:left w:type="dxa" w:w="100"/>
-              <w:bottom w:type="dxa" w:w="60"/>
-              <w:right w:type="dxa" w:w="100"/>
-            </w:tcMar>
-          </w:tcPr>
-          <w:p>
-            <w:r>
-              <w:rPr>
-                <w:sz w:val="19"/>
-                <w:szCs w:val="19"/>
-              </w:rPr>
-              <w:t xml:space="preserve">HOLD_evacuation_centres_until_test_layer_withdrawn</w:t>
-            </w:r>
-          </w:p>
-        </w:tc>
-        <w:tc>
-          <w:tcPr>
-            <w:tcW w:type="dxa" w:w="2600"/>
+            <w:tcW w:type="dxa" w:w="2735"/>
+            <w:tcBorders>
+              <w:top w:val="single" w:color="BFBFBF" w:sz="4"/>
+              <w:left w:val="single" w:color="BFBFBF" w:sz="4"/>
+              <w:bottom w:val="single" w:color="BFBFBF" w:sz="4"/>
+              <w:right w:val="single" w:color="BFBFBF" w:sz="4"/>
+            </w:tcBorders>
+            <w:tcMar>
+              <w:top w:type="dxa" w:w="60"/>
+              <w:left w:type="dxa" w:w="100"/>
+              <w:bottom w:type="dxa" w:w="60"/>
+              <w:right w:type="dxa" w:w="100"/>
+            </w:tcMar>
+          </w:tcPr>
+          <w:p>
+            <w:r>
+              <w:rPr>
+                <w:sz w:val="19"/>
+                <w:szCs w:val="19"/>
+              </w:rPr>
+              <w:t xml:space="preserve">07_evacuation_centres</w:t>
+            </w:r>
+          </w:p>
+        </w:tc>
+        <w:tc>
+          <w:tcPr>
+            <w:tcW w:type="dxa" w:w="2461"/>
             <w:tcBorders>
               <w:top w:val="single" w:color="BFBFBF" w:sz="4"/>
               <w:left w:val="single" w:color="BFBFBF" w:sz="4"/>
@@ -1359,27 +1359,282 @@
         </w:tc>
         <w:tc>
           <w:tcPr>
-            <w:tcW w:type="dxa" w:w="4126"/>
-            <w:tcBorders>
-              <w:top w:val="single" w:color="BFBFBF" w:sz="4"/>
-              <w:left w:val="single" w:color="BFBFBF" w:sz="4"/>
-              <w:bottom w:val="single" w:color="BFBFBF" w:sz="4"/>
-              <w:right w:val="single" w:color="BFBFBF" w:sz="4"/>
-            </w:tcBorders>
-            <w:tcMar>
-              <w:top w:type="dxa" w:w="60"/>
-              <w:left w:type="dxa" w:w="100"/>
-              <w:bottom w:type="dxa" w:w="60"/>
-              <w:right w:type="dxa" w:w="100"/>
-            </w:tcMar>
-          </w:tcPr>
-          <w:p>
-            <w:r>
-              <w:rPr>
-                <w:sz w:val="19"/>
-                <w:szCs w:val="19"/>
-              </w:rPr>
-              <w:t xml:space="preserve">No, not yet</w:t>
+            <w:tcW w:type="dxa" w:w="3830"/>
+            <w:tcBorders>
+              <w:top w:val="single" w:color="BFBFBF" w:sz="4"/>
+              <w:left w:val="single" w:color="BFBFBF" w:sz="4"/>
+              <w:bottom w:val="single" w:color="BFBFBF" w:sz="4"/>
+              <w:right w:val="single" w:color="BFBFBF" w:sz="4"/>
+            </w:tcBorders>
+            <w:tcMar>
+              <w:top w:type="dxa" w:w="60"/>
+              <w:left w:type="dxa" w:w="100"/>
+              <w:bottom w:type="dxa" w:w="60"/>
+              <w:right w:type="dxa" w:w="100"/>
+            </w:tcMar>
+          </w:tcPr>
+          <w:p>
+            <w:r>
+              <w:rPr>
+                <w:sz w:val="19"/>
+                <w:szCs w:val="19"/>
+              </w:rPr>
+              <w:t xml:space="preserve">Foundation now; contribute after duplicate removal</w:t>
+            </w:r>
+          </w:p>
+        </w:tc>
+      </w:tr>
+      <w:tr>
+        <w:trPr>
+          <w:tblHeader w:val="off"/>
+        </w:trPr>
+        <w:tc>
+          <w:tcPr>
+            <w:tcW w:type="dxa" w:w="2735"/>
+            <w:tcBorders>
+              <w:top w:val="single" w:color="BFBFBF" w:sz="4"/>
+              <w:left w:val="single" w:color="BFBFBF" w:sz="4"/>
+              <w:bottom w:val="single" w:color="BFBFBF" w:sz="4"/>
+              <w:right w:val="single" w:color="BFBFBF" w:sz="4"/>
+            </w:tcBorders>
+            <w:tcMar>
+              <w:top w:type="dxa" w:w="60"/>
+              <w:left w:type="dxa" w:w="100"/>
+              <w:bottom w:type="dxa" w:w="60"/>
+              <w:right w:type="dxa" w:w="100"/>
+            </w:tcMar>
+          </w:tcPr>
+          <w:p>
+            <w:r>
+              <w:rPr>
+                <w:sz w:val="19"/>
+                <w:szCs w:val="19"/>
+              </w:rPr>
+              <w:t xml:space="preserve">08_child_sensitivity</w:t>
+            </w:r>
+          </w:p>
+        </w:tc>
+        <w:tc>
+          <w:tcPr>
+            <w:tcW w:type="dxa" w:w="2461"/>
+            <w:tcBorders>
+              <w:top w:val="single" w:color="BFBFBF" w:sz="4"/>
+              <w:left w:val="single" w:color="BFBFBF" w:sz="4"/>
+              <w:bottom w:val="single" w:color="BFBFBF" w:sz="4"/>
+              <w:right w:val="single" w:color="BFBFBF" w:sz="4"/>
+            </w:tcBorders>
+            <w:tcMar>
+              <w:top w:type="dxa" w:w="60"/>
+              <w:left w:type="dxa" w:w="100"/>
+              <w:bottom w:type="dxa" w:w="60"/>
+              <w:right w:type="dxa" w:w="100"/>
+            </w:tcMar>
+          </w:tcPr>
+          <w:p>
+            <w:r>
+              <w:rPr>
+                <w:rFonts w:ascii="Consolas" w:cs="Consolas" w:eastAsia="Consolas" w:hAnsi="Consolas"/>
+                <w:color w:val="1F4E79"/>
+                <w:sz w:val="19"/>
+                <w:szCs w:val="19"/>
+              </w:rPr>
+              <w:t xml:space="preserve">vulnerability_child_sensitivity_th</w:t>
+            </w:r>
+          </w:p>
+        </w:tc>
+        <w:tc>
+          <w:tcPr>
+            <w:tcW w:type="dxa" w:w="3830"/>
+            <w:tcBorders>
+              <w:top w:val="single" w:color="BFBFBF" w:sz="4"/>
+              <w:left w:val="single" w:color="BFBFBF" w:sz="4"/>
+              <w:bottom w:val="single" w:color="BFBFBF" w:sz="4"/>
+              <w:right w:val="single" w:color="BFBFBF" w:sz="4"/>
+            </w:tcBorders>
+            <w:tcMar>
+              <w:top w:type="dxa" w:w="60"/>
+              <w:left w:type="dxa" w:w="100"/>
+              <w:bottom w:type="dxa" w:w="60"/>
+              <w:right w:type="dxa" w:w="100"/>
+            </w:tcMar>
+          </w:tcPr>
+          <w:p>
+            <w:r>
+              <w:rPr>
+                <w:sz w:val="19"/>
+                <w:szCs w:val="19"/>
+              </w:rPr>
+              <w:t xml:space="preserve">Foundation now; contribute after metadata approval</w:t>
+            </w:r>
+          </w:p>
+        </w:tc>
+      </w:tr>
+      <w:tr>
+        <w:trPr>
+          <w:tblHeader w:val="off"/>
+        </w:trPr>
+        <w:tc>
+          <w:tcPr>
+            <w:tcW w:type="dxa" w:w="2735"/>
+            <w:tcBorders>
+              <w:top w:val="single" w:color="BFBFBF" w:sz="4"/>
+              <w:left w:val="single" w:color="BFBFBF" w:sz="4"/>
+              <w:bottom w:val="single" w:color="BFBFBF" w:sz="4"/>
+              <w:right w:val="single" w:color="BFBFBF" w:sz="4"/>
+            </w:tcBorders>
+            <w:tcMar>
+              <w:top w:type="dxa" w:w="60"/>
+              <w:left w:type="dxa" w:w="100"/>
+              <w:bottom w:type="dxa" w:w="60"/>
+              <w:right w:type="dxa" w:w="100"/>
+            </w:tcMar>
+          </w:tcPr>
+          <w:p>
+            <w:r>
+              <w:rPr>
+                <w:sz w:val="19"/>
+                <w:szCs w:val="19"/>
+              </w:rPr>
+              <w:t xml:space="preserve">09_older_person_sensitivity</w:t>
+            </w:r>
+          </w:p>
+        </w:tc>
+        <w:tc>
+          <w:tcPr>
+            <w:tcW w:type="dxa" w:w="2461"/>
+            <w:tcBorders>
+              <w:top w:val="single" w:color="BFBFBF" w:sz="4"/>
+              <w:left w:val="single" w:color="BFBFBF" w:sz="4"/>
+              <w:bottom w:val="single" w:color="BFBFBF" w:sz="4"/>
+              <w:right w:val="single" w:color="BFBFBF" w:sz="4"/>
+            </w:tcBorders>
+            <w:tcMar>
+              <w:top w:type="dxa" w:w="60"/>
+              <w:left w:type="dxa" w:w="100"/>
+              <w:bottom w:type="dxa" w:w="60"/>
+              <w:right w:type="dxa" w:w="100"/>
+            </w:tcMar>
+          </w:tcPr>
+          <w:p>
+            <w:r>
+              <w:rPr>
+                <w:rFonts w:ascii="Consolas" w:cs="Consolas" w:eastAsia="Consolas" w:hAnsi="Consolas"/>
+                <w:color w:val="1F4E79"/>
+                <w:sz w:val="19"/>
+                <w:szCs w:val="19"/>
+              </w:rPr>
+              <w:t xml:space="preserve">vulnerability_elderly_sensitivity_th</w:t>
+            </w:r>
+          </w:p>
+        </w:tc>
+        <w:tc>
+          <w:tcPr>
+            <w:tcW w:type="dxa" w:w="3830"/>
+            <w:tcBorders>
+              <w:top w:val="single" w:color="BFBFBF" w:sz="4"/>
+              <w:left w:val="single" w:color="BFBFBF" w:sz="4"/>
+              <w:bottom w:val="single" w:color="BFBFBF" w:sz="4"/>
+              <w:right w:val="single" w:color="BFBFBF" w:sz="4"/>
+            </w:tcBorders>
+            <w:tcMar>
+              <w:top w:type="dxa" w:w="60"/>
+              <w:left w:type="dxa" w:w="100"/>
+              <w:bottom w:type="dxa" w:w="60"/>
+              <w:right w:type="dxa" w:w="100"/>
+            </w:tcMar>
+          </w:tcPr>
+          <w:p>
+            <w:r>
+              <w:rPr>
+                <w:sz w:val="19"/>
+                <w:szCs w:val="19"/>
+              </w:rPr>
+              <w:t xml:space="preserve">Foundation now; contribute after metadata approval</w:t>
+            </w:r>
+          </w:p>
+        </w:tc>
+      </w:tr>
+      <w:tr>
+        <w:trPr>
+          <w:tblHeader w:val="off"/>
+        </w:trPr>
+        <w:tc>
+          <w:tcPr>
+            <w:tcW w:type="dxa" w:w="2735"/>
+            <w:tcBorders>
+              <w:top w:val="single" w:color="BFBFBF" w:sz="4"/>
+              <w:left w:val="single" w:color="BFBFBF" w:sz="4"/>
+              <w:bottom w:val="single" w:color="BFBFBF" w:sz="4"/>
+              <w:right w:val="single" w:color="BFBFBF" w:sz="4"/>
+            </w:tcBorders>
+            <w:tcMar>
+              <w:top w:type="dxa" w:w="60"/>
+              <w:left w:type="dxa" w:w="100"/>
+              <w:bottom w:type="dxa" w:w="60"/>
+              <w:right w:type="dxa" w:w="100"/>
+            </w:tcMar>
+          </w:tcPr>
+          <w:p>
+            <w:r>
+              <w:rPr>
+                <w:sz w:val="19"/>
+                <w:szCs w:val="19"/>
+              </w:rPr>
+              <w:t xml:space="preserve">10_disability_support_indicator</w:t>
+            </w:r>
+          </w:p>
+        </w:tc>
+        <w:tc>
+          <w:tcPr>
+            <w:tcW w:type="dxa" w:w="2461"/>
+            <w:tcBorders>
+              <w:top w:val="single" w:color="BFBFBF" w:sz="4"/>
+              <w:left w:val="single" w:color="BFBFBF" w:sz="4"/>
+              <w:bottom w:val="single" w:color="BFBFBF" w:sz="4"/>
+              <w:right w:val="single" w:color="BFBFBF" w:sz="4"/>
+            </w:tcBorders>
+            <w:tcMar>
+              <w:top w:type="dxa" w:w="60"/>
+              <w:left w:type="dxa" w:w="100"/>
+              <w:bottom w:type="dxa" w:w="60"/>
+              <w:right w:type="dxa" w:w="100"/>
+            </w:tcMar>
+          </w:tcPr>
+          <w:p>
+            <w:r>
+              <w:rPr>
+                <w:rFonts w:ascii="Consolas" w:cs="Consolas" w:eastAsia="Consolas" w:hAnsi="Consolas"/>
+                <w:color w:val="1F4E79"/>
+                <w:sz w:val="19"/>
+                <w:szCs w:val="19"/>
+              </w:rPr>
+              <w:t xml:space="preserve">vulnerability_disability_class_th</w:t>
+            </w:r>
+          </w:p>
+        </w:tc>
+        <w:tc>
+          <w:tcPr>
+            <w:tcW w:type="dxa" w:w="3830"/>
+            <w:tcBorders>
+              <w:top w:val="single" w:color="BFBFBF" w:sz="4"/>
+              <w:left w:val="single" w:color="BFBFBF" w:sz="4"/>
+              <w:bottom w:val="single" w:color="BFBFBF" w:sz="4"/>
+              <w:right w:val="single" w:color="BFBFBF" w:sz="4"/>
+            </w:tcBorders>
+            <w:tcMar>
+              <w:top w:type="dxa" w:w="60"/>
+              <w:left w:type="dxa" w:w="100"/>
+              <w:bottom w:type="dxa" w:w="60"/>
+              <w:right w:type="dxa" w:w="100"/>
+            </w:tcMar>
+          </w:tcPr>
+          <w:p>
+            <w:r>
+              <w:rPr>
+                <w:sz w:val="19"/>
+                <w:szCs w:val="19"/>
+              </w:rPr>
+              <w:t xml:space="preserve">Foundation now; contribute after class metadata approval</w:t>
             </w:r>
           </w:p>
         </w:tc>
@@ -1395,7 +1650,7 @@
         <w:spacing w:after="120"/>
       </w:pPr>
       <w:r>
-        <w:t xml:space="preserve">The evacuation centres wait because an older test copy of the same 10,303 centres is still in Global Risk. Submitting again now would make every answer count them twice. The GRP team will tell you when the old copy has been withdrawn.</w:t>
+        <w:t xml:space="preserve">Loading these files into an isolated development foundation is not a public contribution. Before a later contribution, evacuation centres still require removal of the older 10,303-centre test copy or answers may count them twice. The three indicator rasters remain separate display/foundation layers: they are not vulnerable-person counts and must not be combined into an unapproved score. Their manifests can be reused after source meaning, licence and vintage are confirmed.</w:t>
       </w:r>
     </w:p>
     <w:p>
@@ -2448,10 +2703,10 @@
         </w:tblBorders>
       </w:tblPr>
       <w:tblGrid>
-        <w:gridCol w:w="2256"/>
-        <w:gridCol w:w="2256"/>
-        <w:gridCol w:w="2256"/>
-        <w:gridCol w:w="2256"/>
+        <w:gridCol w:w="2875"/>
+        <w:gridCol w:w="2316"/>
+        <w:gridCol w:w="2236"/>
+        <w:gridCol w:w="1599"/>
       </w:tblGrid>
       <w:tr>
         <w:trPr>
@@ -2459,7 +2714,7 @@
         </w:trPr>
         <w:tc>
           <w:tcPr>
-            <w:tcW w:type="dxa" w:w="2256"/>
+            <w:tcW w:type="dxa" w:w="2875"/>
             <w:tcBorders>
               <w:top w:val="single" w:color="BFBFBF" w:sz="4"/>
               <w:left w:val="single" w:color="BFBFBF" w:sz="4"/>
@@ -2488,7 +2743,7 @@
         </w:tc>
         <w:tc>
           <w:tcPr>
-            <w:tcW w:type="dxa" w:w="2256"/>
+            <w:tcW w:type="dxa" w:w="2316"/>
             <w:tcBorders>
               <w:top w:val="single" w:color="BFBFBF" w:sz="4"/>
               <w:left w:val="single" w:color="BFBFBF" w:sz="4"/>
@@ -2517,7 +2772,7 @@
         </w:tc>
         <w:tc>
           <w:tcPr>
-            <w:tcW w:type="dxa" w:w="2256"/>
+            <w:tcW w:type="dxa" w:w="2236"/>
             <w:tcBorders>
               <w:top w:val="single" w:color="BFBFBF" w:sz="4"/>
               <w:left w:val="single" w:color="BFBFBF" w:sz="4"/>
@@ -2546,7 +2801,7 @@
         </w:tc>
         <w:tc>
           <w:tcPr>
-            <w:tcW w:type="dxa" w:w="2256"/>
+            <w:tcW w:type="dxa" w:w="1599"/>
             <w:tcBorders>
               <w:top w:val="single" w:color="BFBFBF" w:sz="4"/>
               <w:left w:val="single" w:color="BFBFBF" w:sz="4"/>
@@ -2580,7 +2835,7 @@
         </w:trPr>
         <w:tc>
           <w:tcPr>
-            <w:tcW w:type="dxa" w:w="2256"/>
+            <w:tcW w:type="dxa" w:w="2875"/>
             <w:tcBorders>
               <w:top w:val="single" w:color="BFBFBF" w:sz="4"/>
               <w:left w:val="single" w:color="BFBFBF" w:sz="4"/>
@@ -2606,7 +2861,7 @@
         </w:tc>
         <w:tc>
           <w:tcPr>
-            <w:tcW w:type="dxa" w:w="2256"/>
+            <w:tcW w:type="dxa" w:w="2316"/>
             <w:tcBorders>
               <w:top w:val="single" w:color="BFBFBF" w:sz="4"/>
               <w:left w:val="single" w:color="BFBFBF" w:sz="4"/>
@@ -2632,7 +2887,7 @@
         </w:tc>
         <w:tc>
           <w:tcPr>
-            <w:tcW w:type="dxa" w:w="2256"/>
+            <w:tcW w:type="dxa" w:w="2236"/>
             <w:tcBorders>
               <w:top w:val="single" w:color="BFBFBF" w:sz="4"/>
               <w:left w:val="single" w:color="BFBFBF" w:sz="4"/>
@@ -2658,7 +2913,7 @@
         </w:tc>
         <w:tc>
           <w:tcPr>
-            <w:tcW w:type="dxa" w:w="2256"/>
+            <w:tcW w:type="dxa" w:w="1599"/>
             <w:tcBorders>
               <w:top w:val="single" w:color="BFBFBF" w:sz="4"/>
               <w:left w:val="single" w:color="BFBFBF" w:sz="4"/>
@@ -2681,7 +2936,7 @@
         </w:trPr>
         <w:tc>
           <w:tcPr>
-            <w:tcW w:type="dxa" w:w="2256"/>
+            <w:tcW w:type="dxa" w:w="2875"/>
             <w:tcBorders>
               <w:top w:val="single" w:color="BFBFBF" w:sz="4"/>
               <w:left w:val="single" w:color="BFBFBF" w:sz="4"/>
@@ -2707,7 +2962,7 @@
         </w:tc>
         <w:tc>
           <w:tcPr>
-            <w:tcW w:type="dxa" w:w="2256"/>
+            <w:tcW w:type="dxa" w:w="2316"/>
             <w:tcBorders>
               <w:top w:val="single" w:color="BFBFBF" w:sz="4"/>
               <w:left w:val="single" w:color="BFBFBF" w:sz="4"/>
@@ -2733,7 +2988,7 @@
         </w:tc>
         <w:tc>
           <w:tcPr>
-            <w:tcW w:type="dxa" w:w="2256"/>
+            <w:tcW w:type="dxa" w:w="2236"/>
             <w:tcBorders>
               <w:top w:val="single" w:color="BFBFBF" w:sz="4"/>
               <w:left w:val="single" w:color="BFBFBF" w:sz="4"/>
@@ -2759,7 +3014,7 @@
         </w:tc>
         <w:tc>
           <w:tcPr>
-            <w:tcW w:type="dxa" w:w="2256"/>
+            <w:tcW w:type="dxa" w:w="1599"/>
             <w:tcBorders>
               <w:top w:val="single" w:color="BFBFBF" w:sz="4"/>
               <w:left w:val="single" w:color="BFBFBF" w:sz="4"/>
@@ -2782,7 +3037,7 @@
         </w:trPr>
         <w:tc>
           <w:tcPr>
-            <w:tcW w:type="dxa" w:w="2256"/>
+            <w:tcW w:type="dxa" w:w="2875"/>
             <w:tcBorders>
               <w:top w:val="single" w:color="BFBFBF" w:sz="4"/>
               <w:left w:val="single" w:color="BFBFBF" w:sz="4"/>
@@ -2808,7 +3063,7 @@
         </w:tc>
         <w:tc>
           <w:tcPr>
-            <w:tcW w:type="dxa" w:w="2256"/>
+            <w:tcW w:type="dxa" w:w="2316"/>
             <w:tcBorders>
               <w:top w:val="single" w:color="BFBFBF" w:sz="4"/>
               <w:left w:val="single" w:color="BFBFBF" w:sz="4"/>
@@ -2834,7 +3089,7 @@
         </w:tc>
         <w:tc>
           <w:tcPr>
-            <w:tcW w:type="dxa" w:w="2256"/>
+            <w:tcW w:type="dxa" w:w="2236"/>
             <w:tcBorders>
               <w:top w:val="single" w:color="BFBFBF" w:sz="4"/>
               <w:left w:val="single" w:color="BFBFBF" w:sz="4"/>
@@ -2860,7 +3115,7 @@
         </w:tc>
         <w:tc>
           <w:tcPr>
-            <w:tcW w:type="dxa" w:w="2256"/>
+            <w:tcW w:type="dxa" w:w="1599"/>
             <w:tcBorders>
               <w:top w:val="single" w:color="BFBFBF" w:sz="4"/>
               <w:left w:val="single" w:color="BFBFBF" w:sz="4"/>
@@ -2883,7 +3138,7 @@
         </w:trPr>
         <w:tc>
           <w:tcPr>
-            <w:tcW w:type="dxa" w:w="2256"/>
+            <w:tcW w:type="dxa" w:w="2875"/>
             <w:tcBorders>
               <w:top w:val="single" w:color="BFBFBF" w:sz="4"/>
               <w:left w:val="single" w:color="BFBFBF" w:sz="4"/>
@@ -2909,7 +3164,7 @@
         </w:tc>
         <w:tc>
           <w:tcPr>
-            <w:tcW w:type="dxa" w:w="2256"/>
+            <w:tcW w:type="dxa" w:w="2316"/>
             <w:tcBorders>
               <w:top w:val="single" w:color="BFBFBF" w:sz="4"/>
               <w:left w:val="single" w:color="BFBFBF" w:sz="4"/>
@@ -2935,7 +3190,7 @@
         </w:tc>
         <w:tc>
           <w:tcPr>
-            <w:tcW w:type="dxa" w:w="2256"/>
+            <w:tcW w:type="dxa" w:w="2236"/>
             <w:tcBorders>
               <w:top w:val="single" w:color="BFBFBF" w:sz="4"/>
               <w:left w:val="single" w:color="BFBFBF" w:sz="4"/>
@@ -2961,7 +3216,7 @@
         </w:tc>
         <w:tc>
           <w:tcPr>
-            <w:tcW w:type="dxa" w:w="2256"/>
+            <w:tcW w:type="dxa" w:w="1599"/>
             <w:tcBorders>
               <w:top w:val="single" w:color="BFBFBF" w:sz="4"/>
               <w:left w:val="single" w:color="BFBFBF" w:sz="4"/>
@@ -2984,7 +3239,7 @@
         </w:trPr>
         <w:tc>
           <w:tcPr>
-            <w:tcW w:type="dxa" w:w="2256"/>
+            <w:tcW w:type="dxa" w:w="2875"/>
             <w:tcBorders>
               <w:top w:val="single" w:color="BFBFBF" w:sz="4"/>
               <w:left w:val="single" w:color="BFBFBF" w:sz="4"/>
@@ -3010,7 +3265,7 @@
         </w:tc>
         <w:tc>
           <w:tcPr>
-            <w:tcW w:type="dxa" w:w="2256"/>
+            <w:tcW w:type="dxa" w:w="2316"/>
             <w:tcBorders>
               <w:top w:val="single" w:color="BFBFBF" w:sz="4"/>
               <w:left w:val="single" w:color="BFBFBF" w:sz="4"/>
@@ -3036,7 +3291,7 @@
         </w:tc>
         <w:tc>
           <w:tcPr>
-            <w:tcW w:type="dxa" w:w="2256"/>
+            <w:tcW w:type="dxa" w:w="2236"/>
             <w:tcBorders>
               <w:top w:val="single" w:color="BFBFBF" w:sz="4"/>
               <w:left w:val="single" w:color="BFBFBF" w:sz="4"/>
@@ -3062,7 +3317,7 @@
         </w:tc>
         <w:tc>
           <w:tcPr>
-            <w:tcW w:type="dxa" w:w="2256"/>
+            <w:tcW w:type="dxa" w:w="1599"/>
             <w:tcBorders>
               <w:top w:val="single" w:color="BFBFBF" w:sz="4"/>
               <w:left w:val="single" w:color="BFBFBF" w:sz="4"/>
@@ -3807,8 +4062,8 @@
         </w:tblBorders>
       </w:tblPr>
       <w:tblGrid>
-        <w:gridCol w:w="3600"/>
-        <w:gridCol w:w="5426"/>
+        <w:gridCol w:w="3804"/>
+        <w:gridCol w:w="5222"/>
       </w:tblGrid>
       <w:tr>
         <w:trPr>
@@ -3816,7 +4071,7 @@
         </w:trPr>
         <w:tc>
           <w:tcPr>
-            <w:tcW w:type="dxa" w:w="3600"/>
+            <w:tcW w:type="dxa" w:w="3804"/>
             <w:tcBorders>
               <w:top w:val="single" w:color="BFBFBF" w:sz="4"/>
               <w:left w:val="single" w:color="BFBFBF" w:sz="4"/>
@@ -3845,7 +4100,7 @@
         </w:tc>
         <w:tc>
           <w:tcPr>
-            <w:tcW w:type="dxa" w:w="5426"/>
+            <w:tcW w:type="dxa" w:w="5222"/>
             <w:tcBorders>
               <w:top w:val="single" w:color="BFBFBF" w:sz="4"/>
               <w:left w:val="single" w:color="BFBFBF" w:sz="4"/>
@@ -3879,7 +4134,7 @@
         </w:trPr>
         <w:tc>
           <w:tcPr>
-            <w:tcW w:type="dxa" w:w="3600"/>
+            <w:tcW w:type="dxa" w:w="3804"/>
             <w:tcBorders>
               <w:top w:val="single" w:color="BFBFBF" w:sz="4"/>
               <w:left w:val="single" w:color="BFBFBF" w:sz="4"/>
@@ -3905,7 +4160,7 @@
         </w:tc>
         <w:tc>
           <w:tcPr>
-            <w:tcW w:type="dxa" w:w="5426"/>
+            <w:tcW w:type="dxa" w:w="5222"/>
             <w:tcBorders>
               <w:top w:val="single" w:color="BFBFBF" w:sz="4"/>
               <w:left w:val="single" w:color="BFBFBF" w:sz="4"/>
@@ -3936,7 +4191,7 @@
         </w:trPr>
         <w:tc>
           <w:tcPr>
-            <w:tcW w:type="dxa" w:w="3600"/>
+            <w:tcW w:type="dxa" w:w="3804"/>
             <w:tcBorders>
               <w:top w:val="single" w:color="BFBFBF" w:sz="4"/>
               <w:left w:val="single" w:color="BFBFBF" w:sz="4"/>
@@ -3962,7 +4217,7 @@
         </w:tc>
         <w:tc>
           <w:tcPr>
-            <w:tcW w:type="dxa" w:w="5426"/>
+            <w:tcW w:type="dxa" w:w="5222"/>
             <w:tcBorders>
               <w:top w:val="single" w:color="BFBFBF" w:sz="4"/>
               <w:left w:val="single" w:color="BFBFBF" w:sz="4"/>
@@ -3993,7 +4248,7 @@
         </w:trPr>
         <w:tc>
           <w:tcPr>
-            <w:tcW w:type="dxa" w:w="3600"/>
+            <w:tcW w:type="dxa" w:w="3804"/>
             <w:tcBorders>
               <w:top w:val="single" w:color="BFBFBF" w:sz="4"/>
               <w:left w:val="single" w:color="BFBFBF" w:sz="4"/>
@@ -4019,7 +4274,7 @@
         </w:tc>
         <w:tc>
           <w:tcPr>
-            <w:tcW w:type="dxa" w:w="5426"/>
+            <w:tcW w:type="dxa" w:w="5222"/>
             <w:tcBorders>
               <w:top w:val="single" w:color="BFBFBF" w:sz="4"/>
               <w:left w:val="single" w:color="BFBFBF" w:sz="4"/>
@@ -4050,7 +4305,7 @@
         </w:trPr>
         <w:tc>
           <w:tcPr>
-            <w:tcW w:type="dxa" w:w="3600"/>
+            <w:tcW w:type="dxa" w:w="3804"/>
             <w:tcBorders>
               <w:top w:val="single" w:color="BFBFBF" w:sz="4"/>
               <w:left w:val="single" w:color="BFBFBF" w:sz="4"/>
@@ -4076,7 +4331,7 @@
         </w:tc>
         <w:tc>
           <w:tcPr>
-            <w:tcW w:type="dxa" w:w="5426"/>
+            <w:tcW w:type="dxa" w:w="5222"/>
             <w:tcBorders>
               <w:top w:val="single" w:color="BFBFBF" w:sz="4"/>
               <w:left w:val="single" w:color="BFBFBF" w:sz="4"/>
@@ -4107,7 +4362,7 @@
         </w:trPr>
         <w:tc>
           <w:tcPr>
-            <w:tcW w:type="dxa" w:w="3600"/>
+            <w:tcW w:type="dxa" w:w="3804"/>
             <w:tcBorders>
               <w:top w:val="single" w:color="BFBFBF" w:sz="4"/>
               <w:left w:val="single" w:color="BFBFBF" w:sz="4"/>
@@ -4133,7 +4388,7 @@
         </w:tc>
         <w:tc>
           <w:tcPr>
-            <w:tcW w:type="dxa" w:w="5426"/>
+            <w:tcW w:type="dxa" w:w="5222"/>
             <w:tcBorders>
               <w:top w:val="single" w:color="BFBFBF" w:sz="4"/>
               <w:left w:val="single" w:color="BFBFBF" w:sz="4"/>
@@ -4164,7 +4419,7 @@
         </w:trPr>
         <w:tc>
           <w:tcPr>
-            <w:tcW w:type="dxa" w:w="3600"/>
+            <w:tcW w:type="dxa" w:w="3804"/>
             <w:tcBorders>
               <w:top w:val="single" w:color="BFBFBF" w:sz="4"/>
               <w:left w:val="single" w:color="BFBFBF" w:sz="4"/>
@@ -4190,7 +4445,7 @@
         </w:tc>
         <w:tc>
           <w:tcPr>
-            <w:tcW w:type="dxa" w:w="5426"/>
+            <w:tcW w:type="dxa" w:w="5222"/>
             <w:tcBorders>
               <w:top w:val="single" w:color="BFBFBF" w:sz="4"/>
               <w:left w:val="single" w:color="BFBFBF" w:sz="4"/>
@@ -4237,7 +4492,7 @@
         </w:trPr>
         <w:tc>
           <w:tcPr>
-            <w:tcW w:type="dxa" w:w="3600"/>
+            <w:tcW w:type="dxa" w:w="3804"/>
             <w:tcBorders>
               <w:top w:val="single" w:color="BFBFBF" w:sz="4"/>
               <w:left w:val="single" w:color="BFBFBF" w:sz="4"/>
@@ -4263,7 +4518,7 @@
         </w:tc>
         <w:tc>
           <w:tcPr>
-            <w:tcW w:type="dxa" w:w="5426"/>
+            <w:tcW w:type="dxa" w:w="5222"/>
             <w:tcBorders>
               <w:top w:val="single" w:color="BFBFBF" w:sz="4"/>
               <w:left w:val="single" w:color="BFBFBF" w:sz="4"/>
@@ -4308,7 +4563,7 @@
         </w:trPr>
         <w:tc>
           <w:tcPr>
-            <w:tcW w:type="dxa" w:w="3600"/>
+            <w:tcW w:type="dxa" w:w="3804"/>
             <w:tcBorders>
               <w:top w:val="single" w:color="BFBFBF" w:sz="4"/>
               <w:left w:val="single" w:color="BFBFBF" w:sz="4"/>
@@ -4334,7 +4589,7 @@
         </w:tc>
         <w:tc>
           <w:tcPr>
-            <w:tcW w:type="dxa" w:w="5426"/>
+            <w:tcW w:type="dxa" w:w="5222"/>
             <w:tcBorders>
               <w:top w:val="single" w:color="BFBFBF" w:sz="4"/>
               <w:left w:val="single" w:color="BFBFBF" w:sz="4"/>
@@ -4365,7 +4620,7 @@
         </w:trPr>
         <w:tc>
           <w:tcPr>
-            <w:tcW w:type="dxa" w:w="3600"/>
+            <w:tcW w:type="dxa" w:w="3804"/>
             <w:tcBorders>
               <w:top w:val="single" w:color="BFBFBF" w:sz="4"/>
               <w:left w:val="single" w:color="BFBFBF" w:sz="4"/>
@@ -4400,7 +4655,7 @@
         </w:tc>
         <w:tc>
           <w:tcPr>
-            <w:tcW w:type="dxa" w:w="5426"/>
+            <w:tcW w:type="dxa" w:w="5222"/>
             <w:tcBorders>
               <w:top w:val="single" w:color="BFBFBF" w:sz="4"/>
               <w:left w:val="single" w:color="BFBFBF" w:sz="4"/>
@@ -4491,7 +4746,7 @@
         <w:sz w:val="16"/>
         <w:szCs w:val="16"/>
       </w:rPr>
-      <w:t xml:space="preserve">Global Risk contribution guide · page </w:t>
+      <w:t xml:space="preserve">Sharing flood-preparedness data with the Global Risk Platform · page </w:t>
     </w:r>
     <w:r>
       <w:rPr>
@@ -4642,6 +4897,15 @@
         <w:ind w:left="540" w:hanging="270"/>
       </w:pPr>
     </w:lvl>
+    <w:lvl w:ilvl="1" w:tentative="1">
+      <w:start w:val="1"/>
+      <w:numFmt w:val="bullet"/>
+      <w:lvlText w:val="–"/>
+      <w:lvlJc w:val="left"/>
+      <w:pPr>
+        <w:ind w:left="1000" w:hanging="270"/>
+      </w:pPr>
+    </w:lvl>
   </w:abstractNum>
   <w:abstractNum w:abstractNumId="3" w15:restartNumberingAfterBreak="0">
     <w:multiLevelType w:val="hybridMultilevel"/>
@@ -4652,6 +4916,15 @@
       <w:lvlJc w:val="left"/>
       <w:pPr>
         <w:ind w:left="540" w:hanging="300"/>
+      </w:pPr>
+    </w:lvl>
+    <w:lvl w:ilvl="1" w:tentative="1">
+      <w:start w:val="1"/>
+      <w:numFmt w:val="lowerLetter"/>
+      <w:lvlText w:val="%2."/>
+      <w:lvlJc w:val="left"/>
+      <w:pPr>
+        <w:ind w:left="1000" w:hanging="300"/>
       </w:pPr>
     </w:lvl>
   </w:abstractNum>
@@ -4716,16 +4989,20 @@
     <w:name w:val="Normal"/>
     <w:qFormat/>
   </w:style>
-  <w:style w:type="paragraph" w:styleId="Heading2">
-    <w:name w:val="Heading 2"/>
-    <w:basedOn w:val="Normal"/>
-    <w:next w:val="Normal"/>
-    <w:qFormat/>
-    <w:rPr>
-      <w:color w:val="2E74B5"/>
-      <w:sz w:val="26"/>
-      <w:szCs w:val="26"/>
-    </w:rPr>
+  <w:style w:type="table" w:styleId="TableNormal" w:default="true">
+    <w:name w:val="Normal Table"/>
+    <w:uiPriority w:val="99"/>
+    <w:semiHidden/>
+    <w:unhideWhenUsed/>
+    <w:tblPr>
+      <w:tblInd w:type="dxa" w:w="0"/>
+      <w:tblCellMar>
+        <w:top w:type="dxa" w:w="0"/>
+        <w:left w:type="dxa" w:w="108"/>
+        <w:bottom w:type="dxa" w:w="0"/>
+        <w:right w:type="dxa" w:w="108"/>
+      </w:tblCellMar>
+    </w:tblPr>
   </w:style>
   <w:style w:type="paragraph" w:styleId="Heading3">
     <w:name w:val="Heading 3"/>
@@ -4887,6 +5164,7 @@
     <w:next w:val="Normal"/>
     <w:qFormat/>
     <w:pPr>
+      <w:keepNext/>
       <w:spacing w:after="120" w:before="280"/>
       <w:outlineLvl w:val="0"/>
     </w:pPr>
@@ -4897,6 +5175,25 @@
       <w:color w:val="1F4E79"/>
       <w:sz w:val="28"/>
       <w:szCs w:val="28"/>
+    </w:rPr>
+  </w:style>
+  <w:style w:type="paragraph" w:styleId="Heading2">
+    <w:name w:val="Heading 2"/>
+    <w:basedOn w:val="Normal"/>
+    <w:next w:val="Normal"/>
+    <w:qFormat/>
+    <w:pPr>
+      <w:keepNext/>
+      <w:spacing w:after="100" w:before="220"/>
+      <w:outlineLvl w:val="1"/>
+    </w:pPr>
+    <w:rPr>
+      <w:rFonts w:ascii="Leelawadee UI" w:cs="Leelawadee UI" w:eastAsia="Leelawadee UI" w:hAnsi="Leelawadee UI"/>
+      <w:b/>
+      <w:bCs/>
+      <w:color w:val="2E75B6"/>
+      <w:sz w:val="24"/>
+      <w:szCs w:val="24"/>
     </w:rPr>
   </w:style>
 </w:styles>

</xml_diff>